<commit_message>
Voto AGI 0726017-55: acórdão 2087896, sem gratuidade, autos de origem
Co-Authored-By: Claude Sonnet 5.5 <noreply@anthropic.com>
Claude-Session: https://claude.ai/code/session_01TWDXExYe6fwMAvvXw12aRg
</commit_message>
<xml_diff>
--- a/entregas-0726017-zero/10 AGI 0726017-55 Marcos NP cumprimento de sentença de alimentos quitação não comprovada excesso de execução não alegado na origem (voto do zero).docx
+++ b/entregas-0726017-zero/10 AGI 0726017-55 Marcos NP cumprimento de sentença de alimentos quitação não comprovada excesso de execução não alegado na origem (voto do zero).docx
@@ -912,7 +912,7 @@
           <w:color w:val="000000"/>
           <w:sz w:val="26"/>
         </w:rPr>
-        <w:t xml:space="preserve"> TJDFT, Processo nº 0738156-73.2025.8.07.0000, Rel. Des. Edi Maria Coutinho Bizzi, 4ª Turma Cível, j. 05/02/2026.</w:t>
+        <w:t xml:space="preserve"> TJDFT, Acórdão nº 2087896, Rel. Des. Edi Maria Coutinho Bizzi, 4ª Turma Cível, j. 05/02/2026, DJe 23/02/2026.</w:t>
       </w:r>
       <w:commentRangeEnd w:id="2"/>
       <w:r>
@@ -1147,7 +1147,7 @@
           <w:color w:val="EE0000"/>
           <w:sz w:val="28"/>
         </w:rPr>
-        <w:t>Requer efeito suspensivo, a reforma da decisão para remeter os autos à Contadoria e limitar a execução à diferença apurada, subsidiariamente limitar as constrições ao valor incontroverso (R$ 8.262,62) e a gratuidade de justiça.</w:t>
+        <w:t>Requer efeito suspensivo, a reforma da decisão para remeter os autos à Contadoria e limitar a execução à diferença apurada, subsidiariamente limitar as constrições ao valor incontroverso (R$ 8.262,62).</w:t>
       </w:r>
     </w:p>
     <w:p>
@@ -2217,6 +2217,42 @@
         <w:ind w:firstLine="2268"/>
         <w:jc w:val="both"/>
       </w:pPr>
+      <w:commentRangeStart w:id="9"/>
+      <w:r>
+        <w:rPr>
+          <w:rFonts w:ascii="Arial" w:hAnsi="Arial" w:cs="Arial"/>
+          <w:b w:val="0"/>
+          <w:i w:val="0"/>
+          <w:color w:val="000000"/>
+          <w:sz w:val="28"/>
+        </w:rPr>
+        <w:t>Depois da decisão agravada, o executado repetiu a tese em impugnação à penhora, rejeitada pelo d. Juízo de origem por não ter apresentado demonstrativo discriminado e atualizado do valor tido por correto (ID 281564522 e 288203170, do processo de origem).</w:t>
+      </w:r>
+      <w:commentRangeEnd w:id="9"/>
+      <w:r>
+        <w:rPr>
+          <w:rStyle w:val="CommentReference"/>
+        </w:rPr>
+        <w:commentReference w:id="9"/>
+      </w:r>
+    </w:p>
+    <w:p>
+      <w:pPr>
+        <w:spacing w:line="360" w:lineRule="auto" w:after="0"/>
+        <w:ind w:firstLine="2268"/>
+      </w:pPr>
+      <w:r>
+        <w:rPr>
+          <w:sz w:val="28"/>
+        </w:rPr>
+      </w:r>
+    </w:p>
+    <w:p>
+      <w:pPr>
+        <w:spacing w:line="360" w:lineRule="auto" w:after="0" w:before="0"/>
+        <w:ind w:firstLine="2268"/>
+        <w:jc w:val="both"/>
+      </w:pPr>
       <w:r>
         <w:rPr>
           <w:rFonts w:ascii="Arial" w:hAnsi="Arial" w:cs="Arial"/>
@@ -2273,7 +2309,7 @@
         <w:ind w:left="2268"/>
         <w:jc w:val="both"/>
       </w:pPr>
-      <w:commentRangeStart w:id="9"/>
+      <w:commentRangeStart w:id="10"/>
       <w:r>
         <w:rPr>
           <w:rFonts w:ascii="Arial" w:hAnsi="Arial" w:cs="Arial"/>
@@ -2282,14 +2318,14 @@
           <w:color w:val="000000"/>
           <w:sz w:val="26"/>
         </w:rPr>
-        <w:t>“(...) 5. Se o pedido de substituição da penhora não foi apresentado perante o juízo de origem, sua apreciação por este Tribunal implicaria supressão de instância, vedada pelo art. 1.013, § 1º, do CPC. (...)” (Processo nº 0738156-73.2025.8.07.0000, Relator(a): EDI MARIA COUTINHO BIZZI, 4ª TURMA CÍVEL, data de julgamento: 05/02/2026.) – Grifei</w:t>
+        <w:t>“(...) 5. Se o pedido de substituição da penhora não foi apresentado perante o juízo de origem, sua apreciação por este Tribunal implicaria supressão de instância, vedada pelo art. 1.013, § 1º, do CPC. (...)” (Acórdão 2087896, 0738156-73.2025.8.07.0000, Relator(a): EDI MARIA COUTINHO BIZZI, 4ª TURMA CÍVEL, data de julgamento: 05/02/2026, publicado no DJe: 23/02/2026.) – Grifei</w:t>
       </w:r>
-      <w:commentRangeEnd w:id="9"/>
+      <w:commentRangeEnd w:id="10"/>
       <w:r>
         <w:rPr>
           <w:rStyle w:val="CommentReference"/>
         </w:rPr>
-        <w:commentReference w:id="9"/>
+        <w:commentReference w:id="10"/>
       </w:r>
     </w:p>
     <w:p>
@@ -2365,7 +2401,6 @@
         <w:ind w:firstLine="2268"/>
         <w:jc w:val="both"/>
       </w:pPr>
-      <w:commentRangeStart w:id="10"/>
       <w:r>
         <w:rPr>
           <w:rFonts w:ascii="Arial" w:hAnsi="Arial" w:cs="Arial"/>
@@ -2396,13 +2431,6 @@
         </w:rPr>
         <w:t xml:space="preserve"> ao agravo de instrumento do executado, ADRIANO DA SILVA.</w:t>
       </w:r>
-      <w:commentRangeEnd w:id="10"/>
-      <w:r>
-        <w:rPr>
-          <w:rStyle w:val="CommentReference"/>
-        </w:rPr>
-        <w:commentReference w:id="10"/>
-      </w:r>
     </w:p>
     <w:p>
       <w:pPr>
@@ -3150,7 +3178,7 @@
 
 <file path=word/comments.xml><?xml version="1.0" encoding="utf-8"?>
 <w:comments xmlns:wp14="http://schemas.microsoft.com/office/word/2010/wordprocessingDrawing" xmlns:a="http://schemas.openxmlformats.org/drawingml/2006/main" xmlns:pic="http://schemas.openxmlformats.org/drawingml/2006/picture" xmlns:r="http://schemas.openxmlformats.org/officeDocument/2006/relationships" xmlns:w="http://schemas.openxmlformats.org/wordprocessingml/2006/main" xmlns:wp="http://schemas.openxmlformats.org/drawingml/2006/wordprocessingDrawing" xmlns:mc="http://schemas.openxmlformats.org/markup-compatibility/2006" xmlns:a14="http://schemas.microsoft.com/office/drawing/2010/main" xmlns:w14="http://schemas.microsoft.com/office/word/2010/wordml" xmlns:wpc="http://schemas.microsoft.com/office/word/2010/wordprocessingCanvas" mc:Ignorable="wp14">
-  <w:comment w:id="0" w:author="Minuta GDSXSR" w:initials="MG" w:date="2026-10-29T18:35:18Z">
+  <w:comment w:id="0" w:author="Minuta GDSXSR" w:initials="MG" w:date="2026-10-30T19:45:31Z">
     <w:p>
       <w:pPr>
         <w:pStyle w:val="CommentText"/>
@@ -3166,7 +3194,7 @@
       </w:r>
     </w:p>
   </w:comment>
-  <w:comment w:id="1" w:author="Minuta GDSXSR" w:initials="MG" w:date="2026-10-29T18:35:18Z">
+  <w:comment w:id="1" w:author="Minuta GDSXSR" w:initials="MG" w:date="2026-10-30T19:45:31Z">
     <w:p>
       <w:pPr>
         <w:pStyle w:val="CommentText"/>
@@ -3182,7 +3210,7 @@
       </w:r>
     </w:p>
   </w:comment>
-  <w:comment w:id="2" w:author="Minuta GDSXSR" w:initials="MG" w:date="2026-10-29T18:35:18Z">
+  <w:comment w:id="2" w:author="Minuta GDSXSR" w:initials="MG" w:date="2026-10-30T19:45:31Z">
     <w:p>
       <w:pPr>
         <w:pStyle w:val="CommentText"/>
@@ -3194,11 +3222,11 @@
         <w:annotationRef/>
       </w:r>
       <w:r>
-        <w:t>MINUTA GDSXSR — PENDÊNCIA (C-52, C-67 v47): o iajus devolveu o julgado (ementa lida, item 5) sem o número do acórdão e sem o DJe. Completar no JurisDF o número do acórdão e a publicação, no corpo e na ementa. O julgado trata de substituição de penhora não pedida na origem; foi escolhido pela tese de supressão de instância em AGI, mesma Turma, 2026. Busca estreita feita (4ª TCiv, 2026, cumprimento de sentença, inovação recursal).</w:t>
+        <w:t>MINUTA GDSXSR — Número do acórdão (2087896) e DJe (23/02/2026) informados por Marcos em 30/10/2026, completando a pendência do número que o iajus não devolve (C-67 v47). O julgado trata de substituição de penhora não pedida na origem; foi escolhido pela tese de supressão de instância em AGI, mesma Turma, 2026.</w:t>
       </w:r>
     </w:p>
   </w:comment>
-  <w:comment w:id="3" w:author="Minuta GDSXSR" w:initials="MG" w:date="2026-10-29T18:35:18Z">
+  <w:comment w:id="3" w:author="Minuta GDSXSR" w:initials="MG" w:date="2026-10-30T19:45:31Z">
     <w:p>
       <w:pPr>
         <w:pStyle w:val="CommentText"/>
@@ -3214,7 +3242,7 @@
       </w:r>
     </w:p>
   </w:comment>
-  <w:comment w:id="4" w:author="Minuta GDSXSR" w:initials="MG" w:date="2026-10-29T18:35:18Z">
+  <w:comment w:id="4" w:author="Minuta GDSXSR" w:initials="MG" w:date="2026-10-30T19:45:31Z">
     <w:p>
       <w:pPr>
         <w:pStyle w:val="CommentText"/>
@@ -3230,7 +3258,7 @@
       </w:r>
     </w:p>
   </w:comment>
-  <w:comment w:id="5" w:author="Minuta GDSXSR" w:initials="MG" w:date="2026-10-29T18:35:18Z">
+  <w:comment w:id="5" w:author="Minuta GDSXSR" w:initials="MG" w:date="2026-10-30T19:45:31Z">
     <w:p>
       <w:pPr>
         <w:pStyle w:val="CommentText"/>
@@ -3242,11 +3270,11 @@
         <w:annotationRef/>
       </w:r>
       <w:r>
-        <w:t>MINUTA GDSXSR — Admissibilidade direta (C-3T). A gratuidade pedida no agravo não tem parágrafo próprio no voto (C-3T); ver pendência no dispositivo.</w:t>
+        <w:t>MINUTA GDSXSR — Admissibilidade direta (C-3T), sem parágrafo sobre gratuidade, por orientação de Marcos (30/10/2026).</w:t>
       </w:r>
     </w:p>
   </w:comment>
-  <w:comment w:id="6" w:author="Minuta GDSXSR" w:initials="MG" w:date="2026-10-29T18:35:18Z">
+  <w:comment w:id="6" w:author="Minuta GDSXSR" w:initials="MG" w:date="2026-10-30T19:45:31Z">
     <w:p>
       <w:pPr>
         <w:pStyle w:val="CommentText"/>
@@ -3262,7 +3290,7 @@
       </w:r>
     </w:p>
   </w:comment>
-  <w:comment w:id="7" w:author="Minuta GDSXSR" w:initials="MG" w:date="2026-10-29T18:35:18Z">
+  <w:comment w:id="7" w:author="Minuta GDSXSR" w:initials="MG" w:date="2026-10-30T19:45:31Z">
     <w:p>
       <w:pPr>
         <w:pStyle w:val="CommentText"/>
@@ -3274,11 +3302,11 @@
         <w:annotationRef/>
       </w:r>
       <w:r>
-        <w:t>MINUTA GDSXSR — PONTO DE CONFERÊNCIA (C-52, C-53): (i) a liminar diz que nas folhas de janeiro/2020 a abril/2024 “não há qualquer indicação” de gorjetas; as folhas de 2021 a 2023 registram, porém, a rubrica “estimativa de gorjetas” (provento e desconto de mesmo valor, R$ 330,00 em 2021, R$ 363,60 em 2022 e R$ 390,60 em 2023), sobre a qual incide a pensão de 21% sobre o salário bruto; mantive o texto literal da liminar e acrescentei no voto a precisão (parágrafo seguinte). (ii) De maio a dezembro/2024 as folhas trazem as gorjetas integrais (cerca de R$ 3.000,00) e a pensão descontada sobre o bruto (ex.: maio/2024, R$ 900,54 sobre R$ 4.288,85; ID 275990366), enquanto a planilha da exequente aplica R$ 661,03 fixos de dez/2021 a nov/2025 (ID 272584659 e 272584672, do processo de origem). Se a exequente cobrou diferença também nesses oito meses, haveria cobrança sobre parcela já descontada em folha. Não mudei o resultado (C-03, C-53): o executado não levantou o ponto na impugnação (ver capítulo) e o NP segue a liminar e o modelo AGI 0744819-04. Fato que justificaria DPP: a conferência mês a mês desse período pelo d. Juízo de origem.</w:t>
+        <w:t>MINUTA GDSXSR — PONTO DE CONFERÊNCIA (C-52, C-53): (i) a liminar diz que nas folhas de janeiro/2020 a abril/2024 “não há qualquer indicação” de gorjetas; as folhas de 2021 a 2023 registram, porém, a rubrica “estimativa de gorjetas” (provento e desconto de mesmo valor, R$ 330,00 em 2021, R$ 363,60 em 2022 e R$ 390,60 em 2023), sobre a qual incide a pensão de 21% sobre o salário bruto; mantive o texto literal da liminar e acrescentei no voto a precisão (parágrafo seguinte). (ii) AUTOS DE ORIGEM (lidos em 30/10/2026): a planilha da exequente (ID 272584659 e 272584672, origem) cobra R$ 661,03 fixos por mês; o principal de 2022 a nov/2025 é R$ 33.051,50, exatamente 50 parcelas de R$ 661,03 (47 meses mais três 13º), sem crédito visível das pensões descontadas em folha nesses anos. O único crédito é a soma de R$ 8.143,41 de pagamentos parciais, imputada a 2021 (art. 355 do CC). Os contracheques (ID 275990366, origem) mostram pensão descontada todo mês: cerca de R$ 561,72 em 2021, R$ 618,92 em jan-out/2022, R$ 463,15 em nov/2022 e R$ 497,54 em jan/2023, e de maio a dezembro/2024 a pensão incide sobre as gorjetas integrais (ex.: R$ 900,54 em maio/2024). A exequente afirma que tudo foi abatido (ID 276011964), e a liminar e a decisão agravada adotaram essa premissa, mas a aritmética da planilha não a confirma. Não sei se o desconto foi repassado à alimentanda (contracheque prova o desconto, não o repasse; extratos da genitora no ID 272584692, origem, não li). O executado não levantou o ponto na impugnação: ela é de uma página, pede só 10 dias e vista pessoal, admite o débito de 2025 (R$ 8.262,62 por R$ 661,03 x 11) e junta contracheques sem demonstrativo (ID 275990363, origem). Por isso mantive o NP (C-03, C-53): o ônus era do executado e há supressão de instância. Risco: cobrança em duplicidade de alimentos já pagos em folha, o que justificaria DPP, com devolução ao Juízo de origem para a conferência mês a mês. Decisão de Marcos.</w:t>
       </w:r>
     </w:p>
   </w:comment>
-  <w:comment w:id="8" w:author="Minuta GDSXSR" w:initials="MG" w:date="2026-10-29T18:35:18Z">
+  <w:comment w:id="8" w:author="Minuta GDSXSR" w:initials="MG" w:date="2026-10-30T19:45:31Z">
     <w:p>
       <w:pPr>
         <w:pStyle w:val="CommentText"/>
@@ -3294,7 +3322,7 @@
       </w:r>
     </w:p>
   </w:comment>
-  <w:comment w:id="9" w:author="Minuta GDSXSR" w:initials="MG" w:date="2026-10-29T18:35:18Z">
+  <w:comment w:id="9" w:author="Minuta GDSXSR" w:initials="MG" w:date="2026-10-30T19:45:31Z">
     <w:p>
       <w:pPr>
         <w:pStyle w:val="CommentText"/>
@@ -3306,11 +3334,11 @@
         <w:annotationRef/>
       </w:r>
       <w:r>
-        <w:t>MINUTA GDSXSR — Julgado conferido no iajus (ementa lida, item 5; 4ª Turma Cível, 05/02/2026). Pendência do número do acórdão e do DJe: ver comentário da ementa (C-67 v47).</w:t>
+        <w:t>MINUTA GDSXSR — Autos de origem lidos em 30/10/2026 (0712066-82.2026.8.07.0003). A impugnação à penhora (12/08/2026) traz a tabela de gorjetas dos contracheques e o desligamento em janeiro/2025; a decisão de 25/08/2026 a rejeitou por falta do demonstrativo (CPC 525 §§ 4º e 5º) e por mera reiteração. Fato posterior à decisão agravada, citado só como registro.</w:t>
       </w:r>
     </w:p>
   </w:comment>
-  <w:comment w:id="10" w:author="Minuta GDSXSR" w:initials="MG" w:date="2026-10-29T18:35:18Z">
+  <w:comment w:id="10" w:author="Minuta GDSXSR" w:initials="MG" w:date="2026-10-30T19:45:31Z">
     <w:p>
       <w:pPr>
         <w:pStyle w:val="CommentText"/>
@@ -3322,7 +3350,7 @@
         <w:annotationRef/>
       </w:r>
       <w:r>
-        <w:t>MINUTA GDSXSR — PENDÊNCIA (C-52): o agravo pede a gratuidade de justiça (item h) e foi processado sem preparo porque o pedido, feito na origem, ainda não foi apreciado (ID 85626711 e 275990366); a liminar não decidiu o ponto e a exequente impugnou a declaração de hipossuficiência na origem (ID 276011964: extratos, 99Pay, entradas de R$ 9.304,65 em abril/2026). Não há calibração para esse caso (gratuidade recursal a quem a origem ainda não apreciou); deixei o dispositivo sem parágrafo de gratuidade. Se for deferida, o padrão do Gabinete é parágrafo próprio depois do resultado (C-3F).</w:t>
+        <w:t>MINUTA GDSXSR — Julgado conferido no iajus (ementa lida, item 5; 4ª Turma Cível, 05/02/2026). Número do acórdão e DJe informados por Marcos (30/10/2026).</w:t>
       </w:r>
     </w:p>
   </w:comment>

</xml_diff>